<commit_message>
Auto-generate Word docs from Markdown
</commit_message>
<xml_diff>
--- a/docs/drug_test_integration_spec.docx
+++ b/docs/drug_test_integration_spec.docx
@@ -2,7 +2,7 @@
 <file path=word/document.xml><?xml version="1.0" encoding="utf-8"?>
 <w:document xmlns:w="http://schemas.openxmlformats.org/wordprocessingml/2006/main" xmlns:m="http://schemas.openxmlformats.org/officeDocument/2006/math" xmlns:r="http://schemas.openxmlformats.org/officeDocument/2006/relationships" xmlns:o="urn:schemas-microsoft-com:office:office" xmlns:v="urn:schemas-microsoft-com:vml" xmlns:w10="urn:schemas-microsoft-com:office:word" xmlns:a="http://schemas.openxmlformats.org/drawingml/2006/main" xmlns:pic="http://schemas.openxmlformats.org/drawingml/2006/picture" xmlns:wp="http://schemas.openxmlformats.org/drawingml/2006/wordprocessingDrawing">
   <w:body>
-    <w:bookmarkStart w:id="21" w:name="business-problem"/>
+    <w:bookmarkStart w:id="22" w:name="business-problem"/>
     <w:p>
       <w:pPr>
         <w:pStyle w:val="Heading1"/>
@@ -163,12 +163,38 @@
         </w:pict>
       </w:r>
     </w:p>
+    <w:bookmarkEnd w:id="20"/>
+    <w:bookmarkStart w:id="21" w:name="feature-county-dropdown-access-control"/>
+    <w:p>
+      <w:pPr>
+        <w:pStyle w:val="Heading2"/>
+      </w:pPr>
+      <w:r>
+        <w:t xml:space="preserve">Feature: County Dropdown Access Control</w:t>
+      </w:r>
+    </w:p>
     <w:p>
       <w:pPr>
         <w:pStyle w:val="FirstParagraph"/>
       </w:pPr>
       <w:r>
-        <w:t xml:space="preserve">Feature: County Dropdown Access Control</w:t>
+        <w:rPr>
+          <w:bCs/>
+          <w:b/>
+        </w:rPr>
+        <w:t xml:space="preserve">Background:</w:t>
+      </w:r>
+      <w:r>
+        <w:t xml:space="preserve"> </w:t>
+      </w:r>
+      <w:r>
+        <w:t xml:space="preserve">Given I am logged in</w:t>
+      </w:r>
+      <w:r>
+        <w:t xml:space="preserve"> </w:t>
+      </w:r>
+      <w:r>
+        <w:t xml:space="preserve">And I navigate to the Drug Test Integration page</w:t>
       </w:r>
     </w:p>
     <w:p>
@@ -176,26 +202,10 @@
         <w:pStyle w:val="BodyText"/>
       </w:pPr>
       <w:r>
-        <w:t xml:space="preserve">Background:</w:t>
-      </w:r>
-      <w:r>
-        <w:t xml:space="preserve"> </w:t>
-      </w:r>
-      <w:r>
-        <w:t xml:space="preserve">Given I am logged in</w:t>
-      </w:r>
-      <w:r>
-        <w:t xml:space="preserve"> </w:t>
-      </w:r>
-      <w:r>
-        <w:t xml:space="preserve">And I navigate to the Drug Test Integration page</w:t>
-      </w:r>
-    </w:p>
-    <w:p>
-      <w:pPr>
-        <w:pStyle w:val="BodyText"/>
-      </w:pPr>
-      <w:r>
+        <w:rPr>
+          <w:bCs/>
+          <w:b/>
+        </w:rPr>
         <w:t xml:space="preserve">Scenario Outline: User sees only their assigned counties in the County dropdown</w:t>
       </w:r>
       <w:r>
@@ -653,8 +663,8 @@
         <w:t xml:space="preserve">  | Reference Number |</w:t>
       </w:r>
     </w:p>
-    <w:bookmarkEnd w:id="20"/>
     <w:bookmarkEnd w:id="21"/>
+    <w:bookmarkEnd w:id="22"/>
     <w:sectPr/>
   </w:body>
 </w:document>

</xml_diff>